<commit_message>
docs: record UI redesign and enterprise WMS changes in documentation and Word reports (R11, Z5)
</commit_message>
<xml_diff>
--- a/PPRO-dokumentace.docx
+++ b/PPRO-dokumentace.docx
@@ -201,7 +201,7 @@
               <w:spacing w:before="60" w:after="60"/>
             </w:pPr>
             <w:r>
-              <w:t>7. 10. 2026</w:t>
+              <w:t>21. 10. 2026</w:t>
             </w:r>
           </w:p>
         </w:tc>
@@ -233,7 +233,7 @@
         <w:spacing w:after="120"/>
       </w:pPr>
       <w:r>
-        <w:t>Aplikace eviduje produkty a jejich zatřídění do více kategorií současně (vazba M:N – např. dřevěná káča je v kategorii 'pro batolata' i 'dárky do 500 Kč'). Zásadní inovací je oddělení fyzického stavu na regálech od stavu disponibilního (volného k prodeji). Při přijetí objednávky systém provede okamžitou rezervaci zásoby a v případě nedostatku objednávku striktně odmítne. Fyzický odpis proběhne až při expedici balíku. Každá změna zásoby (příjem z truhlárny, výdej zákazníkovi, meziskladový přesun Třebechovice -&gt; Hradec i inventurní dorovnání) je trvale zapsána v auditním deníku pohybů. Na úvodní obrazovce má majitel přehled 'Co hoří' s produkty pod minimální zásobou a měsíční finanční report tržeb po kategoriích.</w:t>
+        <w:t>Aplikace eviduje produkty a jejich zatřídění do více kategorií současně (vazba M:N – např. dřevěná káča je v kategorii 'pro batolata' i 'dárky do 500 Kč'). Zásadní inovací je oddělení fyzického stavu na regálech od stavu disponibilního (volného k prodeji). Při přijetí objednávky systém provede okamžitou rezervaci zásoby a v případě nedostatku objednávku striktně odmítne. Fyzický odpis proběhne až při expedici balíku. Každá změna zásoby (příjem z truhlárny, výdej zákazníkovi, meziskladový přesun Třebechovice -&gt; Hradec i inventurní dorovnání) je trvale zapsána v auditním deníku pohybů. Na úvodní obrazovce má dispečer přehled kritického stavu zásob pod bezpečnostním limitem a měsíční finanční report tržeb a marží po kategoriích.</w:t>
       </w:r>
     </w:p>
     <w:p>
@@ -241,7 +241,7 @@
         <w:spacing w:after="120"/>
       </w:pPr>
       <w:r>
-        <w:t>Technicky je systém postaven jako třívrstvá enterprise aplikace v jazyce Java 21 s využitím frameworku Spring Boot 3.4.x. Prezentační vrstva využívá Spring MVC a šablonovací engine Thymeleaf s responzivním CSS přizpůsobeným pro ovládání z mobilního telefonu přímo ve skladu. Aplikační vrstva obsahuje servisní služby vynucující striktní byznys pravidla (zákaz záporného stavu, fixace ceny v objednávce, rezervace). Datová vrstva je postavena na Spring Data JPA / Hibernate a relační databázi PostgreSQL 16 provozované v Docker kontejneru. Sestavení řídí Gradle wrapper (verze 9.7+).</w:t>
+        <w:t>Technicky je systém postaven jako třívrstvá enterprise aplikace v jazyce Java 21 s využitím frameworku Spring Boot 3.4.x. Prezentační vrstva využívá Spring MVC a šablonovací engine Thymeleaf s responzivním CSS navrženým ve standardu moderních podnikových WMS/ERP systémů (tabulární čísla, statusové indikátory, monospaced SKU kódy bez AI emodži). Aplikační vrstva obsahuje servisní služby vynucující striktní byznys pravidla (zákaz záporného stavu, fixace ceny v objednávce, rezervace). Datová vrstva je postavena na Spring Data JPA / Hibernate a PostgreSQL 16 v Docker kontejneru. Sestavení řídí Gradle wrapper (verze 9.7+).</w:t>
       </w:r>
     </w:p>
     <w:p>
@@ -856,7 +856,7 @@
               <w:spacing w:before="60" w:after="60"/>
             </w:pPr>
             <w:r>
-              <w:t>Petr Doležal tráví půl dne ve skladu; UI je optimalizováno pro mobil s velkými tlačítky a barevnou indikací ('co hoří').</w:t>
+              <w:t>Skladník se pohybuje mezi regály; UI je optimalizováno pro mobilní terminály s velkými ovládacími prvky.</w:t>
             </w:r>
           </w:p>
         </w:tc>
@@ -870,6 +870,60 @@
             </w:pPr>
             <w:r>
               <w:t>7. 10. 2026</w:t>
+            </w:r>
+          </w:p>
+        </w:tc>
+      </w:tr>
+      <w:tr>
+        <w:tc>
+          <w:tcPr>
+            <w:tcW w:w="700" w:type="dxa"/>
+          </w:tcPr>
+          <w:p>
+            <w:pPr>
+              <w:spacing w:before="60" w:after="60"/>
+            </w:pPr>
+            <w:r>
+              <w:t>R11</w:t>
+            </w:r>
+          </w:p>
+        </w:tc>
+        <w:tc>
+          <w:tcPr>
+            <w:tcW w:w="2400" w:type="dxa"/>
+          </w:tcPr>
+          <w:p>
+            <w:pPr>
+              <w:spacing w:before="60" w:after="60"/>
+            </w:pPr>
+            <w:r>
+              <w:t>Profesionální podnikový WMS design bez AI prvků a emodži</w:t>
+            </w:r>
+          </w:p>
+        </w:tc>
+        <w:tc>
+          <w:tcPr>
+            <w:tcW w:w="4800" w:type="dxa"/>
+          </w:tcPr>
+          <w:p>
+            <w:pPr>
+              <w:spacing w:before="60" w:after="60"/>
+            </w:pPr>
+            <w:r>
+              <w:t>Odstranění všech emodži a meta-textů; zavedení seriózního podnikového vzhledu (tabulární čísla, statusové indikátory, monospaced SKU kódy).</w:t>
+            </w:r>
+          </w:p>
+        </w:tc>
+        <w:tc>
+          <w:tcPr>
+            <w:tcW w:w="1300" w:type="dxa"/>
+          </w:tcPr>
+          <w:p>
+            <w:pPr>
+              <w:spacing w:before="60" w:after="60"/>
+            </w:pPr>
+            <w:r>
+              <w:t>21. 10. 2026</w:t>
             </w:r>
           </w:p>
         </w:tc>
@@ -1170,7 +1224,7 @@
               <w:spacing w:before="60" w:after="60"/>
             </w:pPr>
             <w:r>
-              <w:t>Dashboard s přehledem produktů pod minimálním limitem zásob, barevná vizualizace (červená/oranžová) a rychlá tvorba nákupního požadavku. Viz R10.</w:t>
+              <w:t>Dispečink s přehledem položek pod bezpečnostním limitem zásob, barevná indikace a rychlé operativní transakce. Viz R10.</w:t>
             </w:r>
           </w:p>
         </w:tc>
@@ -1238,6 +1292,73 @@
             </w:pPr>
             <w:r>
               <w:t>Responzivní design pro skladové operace (příjem, přesun, inventura) přizpůsobený dotykovému ovládání. Viz R10.</w:t>
+            </w:r>
+          </w:p>
+        </w:tc>
+        <w:tc>
+          <w:tcPr>
+            <w:tcW w:w="1000" w:type="dxa"/>
+          </w:tcPr>
+          <w:p>
+            <w:pPr>
+              <w:spacing w:before="60" w:after="60"/>
+            </w:pPr>
+            <w:r>
+              <w:t>hotovo</w:t>
+            </w:r>
+          </w:p>
+        </w:tc>
+      </w:tr>
+      <w:tr>
+        <w:tc>
+          <w:tcPr>
+            <w:tcW w:w="600" w:type="dxa"/>
+          </w:tcPr>
+          <w:p>
+            <w:pPr>
+              <w:spacing w:before="60" w:after="60"/>
+            </w:pPr>
+            <w:r>
+              <w:t>Z5</w:t>
+            </w:r>
+          </w:p>
+        </w:tc>
+        <w:tc>
+          <w:tcPr>
+            <w:tcW w:w="1100" w:type="dxa"/>
+          </w:tcPr>
+          <w:p>
+            <w:pPr>
+              <w:spacing w:before="60" w:after="60"/>
+            </w:pPr>
+            <w:r>
+              <w:t>21. 10. 2026</w:t>
+            </w:r>
+          </w:p>
+        </w:tc>
+        <w:tc>
+          <w:tcPr>
+            <w:tcW w:w="2800" w:type="dxa"/>
+          </w:tcPr>
+          <w:p>
+            <w:pPr>
+              <w:spacing w:before="60" w:after="60"/>
+            </w:pPr>
+            <w:r>
+              <w:t>„Prerobiť visáž stránky aby to vyzeralo že to nie je robené umelou inteligenciou (smajlíky a podobne).“</w:t>
+            </w:r>
+          </w:p>
+        </w:tc>
+        <w:tc>
+          <w:tcPr>
+            <w:tcW w:w="3700" w:type="dxa"/>
+          </w:tcPr>
+          <w:p>
+            <w:pPr>
+              <w:spacing w:before="60" w:after="60"/>
+            </w:pPr>
+            <w:r>
+              <w:t>Kompletní redesign webového rozhraní na standard profesionálního WMS systému: odstranění všech emodži, zavedení statusových bodových indikátorů, monospaced SKU kódů a tabulárních čísel. Viz R11.</w:t>
             </w:r>
           </w:p>
         </w:tc>
@@ -1274,7 +1395,7 @@
         <w:spacing w:after="120"/>
       </w:pPr>
       <w:r>
-        <w:t>V první fázi byl vyvinut a otestován plně funkční a spustitelný prototyp webové aplikace na adrese http://localhost:8080:</w:t>
+        <w:t>V rámci dosavadního vývoje byl vytvořen a odladěn plně funkční a spustitelný prototyp webové aplikace na adrese http://localhost:8080:</w:t>
       </w:r>
     </w:p>
     <w:p>
@@ -1282,7 +1403,7 @@
         <w:spacing w:after="120"/>
       </w:pPr>
       <w:r>
-        <w:t>• Dashboard (/): Widget 'CO HOŘÍ' s položkami pod limitem, skladové ukazatele, akce naskladnění a závozu z garáže, auditní deník.</w:t>
+        <w:t>• Skladový a expediční dispečink (/): Přehled KPI, modul kritického stavu zásob pod limitem, operativní transakce (příjem z výroby a svoz dodávkou) a auditní deník posledních pohybů.</w:t>
       </w:r>
     </w:p>
     <w:p>
@@ -1290,7 +1411,7 @@
         <w:spacing w:after="120"/>
       </w:pPr>
       <w:r>
-        <w:t>• Katalog hraček (/products, /products/{id}): Seznam produktů, kategorie (vazba M:N), disponibilní stavy a detail s rozpadem kusů mezi Hradcem a Třebechovicemi.</w:t>
+        <w:t>• Katalog produktů (/products, /products/{id}): Seznam položek s kódovým značením SKU, kategorie (M:N), disponibilní stavy a detail s rozpadem kusů mezi Hradcem a Třebechovicemi.</w:t>
       </w:r>
     </w:p>
     <w:p>
@@ -1298,7 +1419,7 @@
         <w:spacing w:after="120"/>
       </w:pPr>
       <w:r>
-        <w:t>• Sklady a převody (/warehouse): Meziskladový svoz dodávkou, inventurní vyrovnání a kompletní auditní skladový deník.</w:t>
+        <w:t>• Skladové hospodářství a převody (/warehouse): Meziskladový svoz dodávkou, inventurní vyrovnání s povinným zdůvodněním a centrální auditní skladový deník.</w:t>
       </w:r>
     </w:p>
     <w:p>
@@ -1306,7 +1427,7 @@
         <w:spacing w:after="120"/>
       </w:pPr>
       <w:r>
-        <w:t>• Objednávky (/orders): Seznam objednávek, simulátor nákupu z e-shopu s automatickou rezervací či odmítnutím, tlačítko Zabalit a expedovat s fyzickým odpisem.</w:t>
+        <w:t>• Objednávky a expedice (/orders): Seznam objednávek se zafixovanými cenami (Price Snapshot), simulace e-shopu s automatickou rezervací či zamítnutím a tlačítko expedice balíku.</w:t>
       </w:r>
     </w:p>
     <w:p>
@@ -1314,7 +1435,7 @@
         <w:spacing w:after="120"/>
       </w:pPr>
       <w:r>
-        <w:t>• Finanční reporty (/reports): Měsíční obrat, nákupní náklady a hrubá marže členěná po kategoriích hraček.</w:t>
+        <w:t>• Rentabilita a obrat (/reports): Měsíční obrat, nákupní náklady, hrubá marže a procentuální podíl na celkových tržbách členěný po kategoriích.</w:t>
       </w:r>
     </w:p>
     <w:sectPr>

</xml_diff>